<commit_message>
Started working on the introduction of chapter one
</commit_message>
<xml_diff>
--- a/report/Abonkwe Princely (SC23A522) report.docx
+++ b/report/Abonkwe Princely (SC23A522) report.docx
@@ -2,15 +2,309 @@
 <file path=word/document.xml><?xml version="1.0" encoding="utf-8"?>
 <w:document xmlns:wpc="http://schemas.microsoft.com/office/word/2010/wordprocessingCanvas" xmlns:cx="http://schemas.microsoft.com/office/drawing/2014/chartex" xmlns:cx1="http://schemas.microsoft.com/office/drawing/2015/9/8/chartex" xmlns:cx2="http://schemas.microsoft.com/office/drawing/2015/10/21/chartex" xmlns:cx3="http://schemas.microsoft.com/office/drawing/2016/5/9/chartex" xmlns:cx4="http://schemas.microsoft.com/office/drawing/2016/5/10/chartex" xmlns:cx5="http://schemas.microsoft.com/office/drawing/2016/5/11/chartex" xmlns:cx6="http://schemas.microsoft.com/office/drawing/2016/5/12/chartex" xmlns:cx7="http://schemas.microsoft.com/office/drawing/2016/5/13/chartex" xmlns:cx8="http://schemas.microsoft.com/office/drawing/2016/5/14/chartex" xmlns:mc="http://schemas.openxmlformats.org/markup-compatibility/2006" xmlns:aink="http://schemas.microsoft.com/office/drawing/2016/ink" xmlns:am3d="http://schemas.microsoft.com/office/drawing/2017/model3d" xmlns:o="urn:schemas-microsoft-com:office:office" xmlns:oel="http://schemas.microsoft.com/office/2019/extlst" xmlns:r="http://schemas.openxmlformats.org/officeDocument/2006/relationships" xmlns:m="http://schemas.openxmlformats.org/officeDocument/2006/math" xmlns:v="urn:schemas-microsoft-com:vml" xmlns:wp14="http://schemas.microsoft.com/office/word/2010/wordprocessingDrawing" xmlns:wp="http://schemas.openxmlformats.org/drawingml/2006/wordprocessingDrawing" xmlns:w10="urn:schemas-microsoft-com:office:word" xmlns:w="http://schemas.openxmlformats.org/wordprocessingml/2006/main" xmlns:w14="http://schemas.microsoft.com/office/word/2010/wordml" xmlns:w15="http://schemas.microsoft.com/office/word/2012/wordml" xmlns:w16cex="http://schemas.microsoft.com/office/word/2018/wordml/cex" xmlns:w16cid="http://schemas.microsoft.com/office/word/2016/wordml/cid" xmlns:w16="http://schemas.microsoft.com/office/word/2018/wordml" xmlns:w16du="http://schemas.microsoft.com/office/word/2023/wordml/word16du" xmlns:w16sdtdh="http://schemas.microsoft.com/office/word/2020/wordml/sdtdatahash" xmlns:w16sdtfl="http://schemas.microsoft.com/office/word/2024/wordml/sdtformatlock" xmlns:w16se="http://schemas.microsoft.com/office/word/2015/wordml/symex" xmlns:wpg="http://schemas.microsoft.com/office/word/2010/wordprocessingGroup" xmlns:wpi="http://schemas.microsoft.com/office/word/2010/wordprocessingInk" xmlns:wne="http://schemas.microsoft.com/office/word/2006/wordml" xmlns:wps="http://schemas.microsoft.com/office/word/2010/wordprocessingShape" mc:Ignorable="w14 w15 w16se w16cid w16 w16cex w16sdtdh w16sdtfl w16du wp14">
   <w:body>
-    <w:p/>
+    <w:p>
+      <w:pPr>
+        <w:jc w:val="center"/>
+        <w:rPr>
+          <w:b/>
+          <w:bCs/>
+          <w:sz w:val="32"/>
+          <w:szCs w:val="32"/>
+        </w:rPr>
+      </w:pPr>
+      <w:r>
+        <w:rPr>
+          <w:b/>
+          <w:bCs/>
+          <w:sz w:val="32"/>
+          <w:szCs w:val="32"/>
+        </w:rPr>
+        <w:t>CHAPTER ONE</w:t>
+      </w:r>
+      <w:r>
+        <w:rPr>
+          <w:b/>
+          <w:bCs/>
+          <w:sz w:val="32"/>
+          <w:szCs w:val="32"/>
+        </w:rPr>
+        <w:t xml:space="preserve"> </w:t>
+      </w:r>
+    </w:p>
+    <w:p>
+      <w:pPr>
+        <w:pStyle w:val="ListParagraph"/>
+        <w:numPr>
+          <w:ilvl w:val="1"/>
+          <w:numId w:val="1"/>
+        </w:numPr>
+        <w:jc w:val="both"/>
+      </w:pPr>
+      <w:r>
+        <w:t>Introduction:</w:t>
+      </w:r>
+    </w:p>
+    <w:p>
+      <w:pPr>
+        <w:pStyle w:val="ListParagraph"/>
+        <w:ind w:left="360"/>
+        <w:jc w:val="both"/>
+      </w:pPr>
+      <w:r>
+        <w:t>Digital payments and wallet systems are rapidly growing in usage, for both online and in-person purchases</w:t>
+      </w:r>
+      <w:r>
+        <w:t xml:space="preserve">. </w:t>
+      </w:r>
+      <w:r>
+        <w:t>These software-based systems, which securely store payment information and passwords, are rapidly becoming the preferred method for transactions worldwide, reshaping how consumers and businesses interact with money</w:t>
+      </w:r>
+      <w:r>
+        <w:t>. The shift towards digital wallets is part of a broader trend driven by advancements in technology, changing consumer preferences and the need for more efficient, secure payment methods</w:t>
+      </w:r>
+      <w:r>
+        <w:fldChar w:fldCharType="begin"/>
+      </w:r>
+      <w:r>
+        <w:instrText xml:space="preserve"> ADDIN ZOTERO_ITEM CSL_CITATION {"citationID":"IEEsi3PJ","properties":{"unsorted":false,"formattedCitation":"[1]","plainCitation":"[1]","noteIndex":0},"citationItems":[{"id":3,"uris":["http://zotero.org/users/local/uyYJex6H/items/BC2VD3DJ"],"itemData":{"id":3,"type":"webpage","abstract":"Marqeta, Alipay+ and Airwallex executives provide insights on the future of digital payments, regional adoption trends and the emergence of super wallets","language":"en","title":"Digital Wallets Set to Revolutionise Global Finance by 2025","URL":"https://fintechmagazine.com/articles/digital-wallets-set-to-revolutionise-global-finance-by-2025","author":[{"family":"Thompsett","given":"Louis"}],"accessed":{"date-parts":[["2026",3,20]]},"issued":{"date-parts":[["2024",11,26]]}}}],"schema":"https://github.com/citation-style-language/schema/raw/master/csl-citation.json"} </w:instrText>
+      </w:r>
+      <w:r>
+        <w:fldChar w:fldCharType="separate"/>
+      </w:r>
+      <w:r>
+        <w:rPr>
+          <w:rFonts w:ascii="Calibri" w:hAnsi="Calibri" w:cs="Calibri"/>
+        </w:rPr>
+        <w:t>[1]</w:t>
+      </w:r>
+      <w:r>
+        <w:fldChar w:fldCharType="end"/>
+      </w:r>
+      <w:r>
+        <w:t xml:space="preserve">. </w:t>
+      </w:r>
+      <w:r>
+        <w:t>A digital payment and wallet system is a software application that stores payment information, allowing users to pay for purchases directly from their devices instead of using their physical cards. Similar to a physical wallet,  digital payments and wallet systems holds various payments methods such as mobile money, orange money, debit cards bank account numbers that users can use at the point of sale to perform Peer-to-Peer (P2P) transactions</w:t>
+      </w:r>
+      <w:r>
+        <w:fldChar w:fldCharType="begin"/>
+      </w:r>
+      <w:r>
+        <w:instrText xml:space="preserve"> ADDIN ZOTERO_ITEM CSL_CITATION {"citationID":"tXTEctPc","properties":{"unsorted":false,"formattedCitation":"[2]","plainCitation":"[2]","noteIndex":0},"citationItems":[{"id":6,"uris":["http://zotero.org/users/local/uyYJex6H/items/H9L9MX8I"],"itemData":{"id":6,"type":"webpage","title":"How digital wallets work and how to accept a digital wallet | Stripe","URL":"https://stripe.com/resources/more/digital-wallets-101","accessed":{"date-parts":[["2026",3,20]]}}}],"schema":"https://github.com/citation-style-language/schema/raw/master/csl-citation.json"} </w:instrText>
+      </w:r>
+      <w:r>
+        <w:fldChar w:fldCharType="separate"/>
+      </w:r>
+      <w:r>
+        <w:rPr>
+          <w:rFonts w:ascii="Calibri" w:hAnsi="Calibri" w:cs="Calibri"/>
+        </w:rPr>
+        <w:t>[2]</w:t>
+      </w:r>
+      <w:r>
+        <w:fldChar w:fldCharType="end"/>
+      </w:r>
+      <w:r>
+        <w:t>.</w:t>
+      </w:r>
+    </w:p>
+    <w:p>
+      <w:pPr>
+        <w:pStyle w:val="ListParagraph"/>
+        <w:ind w:left="360"/>
+        <w:jc w:val="both"/>
+      </w:pPr>
+    </w:p>
+    <w:p>
+      <w:pPr>
+        <w:pStyle w:val="ListParagraph"/>
+        <w:ind w:left="360"/>
+        <w:jc w:val="both"/>
+      </w:pPr>
+      <w:r>
+        <w:t>This project will be implemented using a modern python backend and web framework (</w:t>
+      </w:r>
+      <w:proofErr w:type="spellStart"/>
+      <w:r>
+        <w:t>FastA</w:t>
+      </w:r>
+      <w:r>
+        <w:t>PI</w:t>
+      </w:r>
+      <w:proofErr w:type="spellEnd"/>
+      <w:r>
+        <w:t>) which is very efficient in building APIs due to its asynchronous nature</w:t>
+      </w:r>
+      <w:r>
+        <w:t xml:space="preserve">. </w:t>
+      </w:r>
+      <w:proofErr w:type="spellStart"/>
+      <w:r>
+        <w:t>FastAPI</w:t>
+      </w:r>
+      <w:proofErr w:type="spellEnd"/>
+      <w:r>
+        <w:t xml:space="preserve"> can handle thousands of concurrent requests, making it a natural choice for scalable fintech solutions like real-time fintech platforms, and digital payments and wallet systems</w:t>
+      </w:r>
+      <w:r>
+        <w:fldChar w:fldCharType="begin"/>
+      </w:r>
+      <w:r>
+        <w:instrText xml:space="preserve"> ADDIN ZOTERO_ITEM CSL_CITATION {"citationID":"dy6NTKGt","properties":{"unsorted":false,"formattedCitation":"[3]","plainCitation":"[3]","noteIndex":0},"citationItems":[{"id":8,"uris":["http://zotero.org/users/local/uyYJex6H/items/NDAAQMED"],"itemData":{"id":8,"type":"webpage","title":"Flask vs FastAPI: Sync and Async Comparison in Fintech Applications - Python Tutorial","URL":"https://www.marketcalls.in/python/flask-vs-fastapi-sync-and-async-comparison-in-fintech-applications-python-tutorial.html","accessed":{"date-parts":[["2026",3,20]]}}}],"schema":"https://github.com/citation-style-language/schema/raw/master/csl-citation.json"} </w:instrText>
+      </w:r>
+      <w:r>
+        <w:fldChar w:fldCharType="separate"/>
+      </w:r>
+      <w:r>
+        <w:rPr>
+          <w:rFonts w:ascii="Calibri" w:hAnsi="Calibri" w:cs="Calibri"/>
+        </w:rPr>
+        <w:t>[3]</w:t>
+      </w:r>
+      <w:r>
+        <w:fldChar w:fldCharType="end"/>
+      </w:r>
+      <w:r>
+        <w:t>. The frontend will be implemented using React Native which is an open-source framework that allows developers to create mobile applications using Typescript and React. With React Native the digital wallet and payment system can be developed for both Android and iOS platforms without needing to write separate code for each platform, saving both time and resources. React Native’s ability to build high-performing apps with native-like experiences makes it an excellent choice for developing such wallet applications. React Native also enables the creation of smooth responsive, and native-like experiences, making wallet apps highly interactive and user</w:t>
+      </w:r>
+      <w:r>
+        <w:t>-friendly</w:t>
+      </w:r>
+    </w:p>
+    <w:p>
+      <w:pPr>
+        <w:jc w:val="both"/>
+      </w:pPr>
+    </w:p>
     <w:sectPr>
-      <w:pgSz w:w="12240" w:h="15840"/>
+      <w:pgSz w:w="11906" w:h="16838" w:code="9"/>
       <w:pgMar w:top="1440" w:right="1440" w:bottom="1440" w:left="1440" w:header="720" w:footer="720" w:gutter="0"/>
       <w:cols w:space="720"/>
       <w:docGrid w:linePitch="360"/>
     </w:sectPr>
   </w:body>
 </w:document>
+</file>
+
+<file path=word/numbering.xml><?xml version="1.0" encoding="utf-8"?>
+<w:numbering xmlns:wpc="http://schemas.microsoft.com/office/word/2010/wordprocessingCanvas" xmlns:cx="http://schemas.microsoft.com/office/drawing/2014/chartex" xmlns:cx1="http://schemas.microsoft.com/office/drawing/2015/9/8/chartex" xmlns:cx2="http://schemas.microsoft.com/office/drawing/2015/10/21/chartex" xmlns:cx3="http://schemas.microsoft.com/office/drawing/2016/5/9/chartex" xmlns:cx4="http://schemas.microsoft.com/office/drawing/2016/5/10/chartex" xmlns:cx5="http://schemas.microsoft.com/office/drawing/2016/5/11/chartex" xmlns:cx6="http://schemas.microsoft.com/office/drawing/2016/5/12/chartex" xmlns:cx7="http://schemas.microsoft.com/office/drawing/2016/5/13/chartex" xmlns:cx8="http://schemas.microsoft.com/office/drawing/2016/5/14/chartex" xmlns:mc="http://schemas.openxmlformats.org/markup-compatibility/2006" xmlns:aink="http://schemas.microsoft.com/office/drawing/2016/ink" xmlns:am3d="http://schemas.microsoft.com/office/drawing/2017/model3d" xmlns:o="urn:schemas-microsoft-com:office:office" xmlns:oel="http://schemas.microsoft.com/office/2019/extlst" xmlns:r="http://schemas.openxmlformats.org/officeDocument/2006/relationships" xmlns:m="http://schemas.openxmlformats.org/officeDocument/2006/math" xmlns:v="urn:schemas-microsoft-com:vml" xmlns:wp14="http://schemas.microsoft.com/office/word/2010/wordprocessingDrawing" xmlns:wp="http://schemas.openxmlformats.org/drawingml/2006/wordprocessingDrawing" xmlns:w10="urn:schemas-microsoft-com:office:word" xmlns:w="http://schemas.openxmlformats.org/wordprocessingml/2006/main" xmlns:w14="http://schemas.microsoft.com/office/word/2010/wordml" xmlns:w15="http://schemas.microsoft.com/office/word/2012/wordml" xmlns:w16cex="http://schemas.microsoft.com/office/word/2018/wordml/cex" xmlns:w16cid="http://schemas.microsoft.com/office/word/2016/wordml/cid" xmlns:w16="http://schemas.microsoft.com/office/word/2018/wordml" xmlns:w16du="http://schemas.microsoft.com/office/word/2023/wordml/word16du" xmlns:w16sdtdh="http://schemas.microsoft.com/office/word/2020/wordml/sdtdatahash" xmlns:w16sdtfl="http://schemas.microsoft.com/office/word/2024/wordml/sdtformatlock" xmlns:w16se="http://schemas.microsoft.com/office/word/2015/wordml/symex" xmlns:wpg="http://schemas.microsoft.com/office/word/2010/wordprocessingGroup" xmlns:wpi="http://schemas.microsoft.com/office/word/2010/wordprocessingInk" xmlns:wne="http://schemas.microsoft.com/office/word/2006/wordml" xmlns:wps="http://schemas.microsoft.com/office/word/2010/wordprocessingShape" mc:Ignorable="w14 w15 w16se w16cid w16 w16cex w16sdtdh w16sdtfl w16du wp14">
+  <w:abstractNum w:abstractNumId="0" w15:restartNumberingAfterBreak="0">
+    <w:nsid w:val="6A424428"/>
+    <w:multiLevelType w:val="multilevel"/>
+    <w:tmpl w:val="A684A5C0"/>
+    <w:lvl w:ilvl="0">
+      <w:start w:val="1"/>
+      <w:numFmt w:val="decimal"/>
+      <w:lvlText w:val="%1"/>
+      <w:lvlJc w:val="left"/>
+      <w:pPr>
+        <w:ind w:left="360" w:hanging="360"/>
+      </w:pPr>
+      <w:rPr>
+        <w:rFonts w:hint="default"/>
+      </w:rPr>
+    </w:lvl>
+    <w:lvl w:ilvl="1">
+      <w:start w:val="1"/>
+      <w:numFmt w:val="decimal"/>
+      <w:lvlText w:val="%1.%2"/>
+      <w:lvlJc w:val="left"/>
+      <w:pPr>
+        <w:ind w:left="360" w:hanging="360"/>
+      </w:pPr>
+      <w:rPr>
+        <w:rFonts w:hint="default"/>
+      </w:rPr>
+    </w:lvl>
+    <w:lvl w:ilvl="2">
+      <w:start w:val="1"/>
+      <w:numFmt w:val="decimal"/>
+      <w:lvlText w:val="%1.%2.%3"/>
+      <w:lvlJc w:val="left"/>
+      <w:pPr>
+        <w:ind w:left="720" w:hanging="720"/>
+      </w:pPr>
+      <w:rPr>
+        <w:rFonts w:hint="default"/>
+      </w:rPr>
+    </w:lvl>
+    <w:lvl w:ilvl="3">
+      <w:start w:val="1"/>
+      <w:numFmt w:val="decimal"/>
+      <w:lvlText w:val="%1.%2.%3.%4"/>
+      <w:lvlJc w:val="left"/>
+      <w:pPr>
+        <w:ind w:left="720" w:hanging="720"/>
+      </w:pPr>
+      <w:rPr>
+        <w:rFonts w:hint="default"/>
+      </w:rPr>
+    </w:lvl>
+    <w:lvl w:ilvl="4">
+      <w:start w:val="1"/>
+      <w:numFmt w:val="decimal"/>
+      <w:lvlText w:val="%1.%2.%3.%4.%5"/>
+      <w:lvlJc w:val="left"/>
+      <w:pPr>
+        <w:ind w:left="1080" w:hanging="1080"/>
+      </w:pPr>
+      <w:rPr>
+        <w:rFonts w:hint="default"/>
+      </w:rPr>
+    </w:lvl>
+    <w:lvl w:ilvl="5">
+      <w:start w:val="1"/>
+      <w:numFmt w:val="decimal"/>
+      <w:lvlText w:val="%1.%2.%3.%4.%5.%6"/>
+      <w:lvlJc w:val="left"/>
+      <w:pPr>
+        <w:ind w:left="1080" w:hanging="1080"/>
+      </w:pPr>
+      <w:rPr>
+        <w:rFonts w:hint="default"/>
+      </w:rPr>
+    </w:lvl>
+    <w:lvl w:ilvl="6">
+      <w:start w:val="1"/>
+      <w:numFmt w:val="decimal"/>
+      <w:lvlText w:val="%1.%2.%3.%4.%5.%6.%7"/>
+      <w:lvlJc w:val="left"/>
+      <w:pPr>
+        <w:ind w:left="1440" w:hanging="1440"/>
+      </w:pPr>
+      <w:rPr>
+        <w:rFonts w:hint="default"/>
+      </w:rPr>
+    </w:lvl>
+    <w:lvl w:ilvl="7">
+      <w:start w:val="1"/>
+      <w:numFmt w:val="decimal"/>
+      <w:lvlText w:val="%1.%2.%3.%4.%5.%6.%7.%8"/>
+      <w:lvlJc w:val="left"/>
+      <w:pPr>
+        <w:ind w:left="1440" w:hanging="1440"/>
+      </w:pPr>
+      <w:rPr>
+        <w:rFonts w:hint="default"/>
+      </w:rPr>
+    </w:lvl>
+    <w:lvl w:ilvl="8">
+      <w:start w:val="1"/>
+      <w:numFmt w:val="decimal"/>
+      <w:lvlText w:val="%1.%2.%3.%4.%5.%6.%7.%8.%9"/>
+      <w:lvlJc w:val="left"/>
+      <w:pPr>
+        <w:ind w:left="1800" w:hanging="1800"/>
+      </w:pPr>
+      <w:rPr>
+        <w:rFonts w:hint="default"/>
+      </w:rPr>
+    </w:lvl>
+  </w:abstractNum>
+  <w:num w:numId="1" w16cid:durableId="847403145">
+    <w:abstractNumId w:val="0"/>
+  </w:num>
+</w:numbering>
 </file>
 
 <file path=word/styles.xml><?xml version="1.0" encoding="utf-8"?>
@@ -616,7 +910,6 @@
   <w:style w:type="character" w:default="1" w:styleId="DefaultParagraphFont">
     <w:name w:val="Default Paragraph Font"/>
     <w:uiPriority w:val="1"/>
-    <w:semiHidden/>
     <w:unhideWhenUsed/>
   </w:style>
   <w:style w:type="table" w:default="1" w:styleId="TableNormal">
@@ -929,6 +1222,21 @@
       <w:color w:val="2F5496" w:themeColor="accent1" w:themeShade="BF"/>
       <w:spacing w:val="5"/>
     </w:rPr>
+  </w:style>
+  <w:style w:type="paragraph" w:styleId="Bibliography">
+    <w:name w:val="Bibliography"/>
+    <w:basedOn w:val="Normal"/>
+    <w:next w:val="Normal"/>
+    <w:uiPriority w:val="37"/>
+    <w:unhideWhenUsed/>
+    <w:rsid w:val="005F382A"/>
+    <w:pPr>
+      <w:tabs>
+        <w:tab w:val="left" w:pos="384"/>
+      </w:tabs>
+      <w:spacing w:after="0" w:line="240" w:lineRule="auto"/>
+      <w:ind w:left="384" w:hanging="384"/>
+    </w:pPr>
   </w:style>
 </w:styles>
 </file>

</xml_diff>